<commit_message>
Refactorizacion cientifica Q1: validacion espacial, Nested CV, SMOTENC, Macro F1, econometria espacial y reportes automaticos
</commit_message>
<xml_diff>
--- a/reports/Articulo_Homicidios_Guayaquil.docx
+++ b/reports/Articulo_Homicidios_Guayaquil.docx
@@ -10,9 +10,9 @@
         <w:rPr>
           <w:rFonts w:ascii="Arial" w:hAnsi="Arial"/>
           <w:b/>
-          <w:sz w:val="36"/>
+          <w:sz w:val="32"/>
         </w:rPr>
-        <w:t>Estudio Comparativo de Modelos Multiclase para la Predicción del Mecanismo del Homicidio en Guayaquil: Evaluando el Impacto de las Variables Espaciales</w:t>
+        <w:t>Predicción del Mecanismo de Homicidios en Guayaquil Mediante Aprendizaje Automático Enriquecido con Covariables Geográficas: Un Enfoque de Validación Espacial Sin Fuga de Datos</w:t>
       </w:r>
     </w:p>
     <w:p>
@@ -20,14 +20,14 @@
         <w:jc w:val="center"/>
       </w:pPr>
       <w:r>
-        <w:t>Autor: Grupo de Investigación en Ciencia de Datos Aplicada a la Seguridad</w:t>
+        <w:t>Autor: Grupo de Investigación en GeoAI &amp; Criminología Computacional</w:t>
         <w:br/>
         <w:t>Fecha: Julio 2026</w:t>
       </w:r>
     </w:p>
     <w:p>
       <w:pPr>
-        <w:spacing w:after="480"/>
+        <w:spacing w:after="360"/>
       </w:pPr>
     </w:p>
     <w:p>
@@ -40,7 +40,7 @@
     </w:p>
     <w:p>
       <w:r>
-        <w:t>Este estudio presenta un análisis exhaustivo y comparativo de tres algoritmos de clasificación multiclase (Regresión Logística Multinomial, XGBoost Multiclase y G-XGBoost Espacial) para predecir el mecanismo de homicidio en la ciudad de Guayaquil, Ecuador. Utilizando datos oficiales desagregados de los años 2024 a 2026, comparamos modelos entrenados únicamente con características demográficas y temporales frente a modelos que incorporan coordenadas geográficas (latitud/longitud) y divisiones administrativas (parroquias, distritos y zonas). Los resultados revelan que la inclusión de variables espaciales a través de G-XGBoost Espacial mejora significativamente la capacidad predictiva del modelo, obteniendo el mejor rendimiento general. Este artículo discute las implicaciones para la formulación de políticas públicas de seguridad basadas en datos geográficos.</w:t>
+        <w:t>Este estudio evalúa la capacidad discriminativa de clasificadores de aprendizaje automático para predecir el mecanismo de homicidio (Arma de Fuego, Arma Blanca, Otros) en la Zona 8 de Guayaquil. Para responder a las exigencias de rigor metodológico, se implementó una estrategia de validación espacial agrupada (GroupKFold por Parroquia) y se eliminó toda posibilidad de fuga de datos (Data Leakage) encapsulando el preprocesamiento y SMOTENC en pipelines de imbalanced-learn. Los resultados confirman que el modelo 'XGBoost con Covariables Geográficas' supera sustancialmente a los baselines no espaciales, alcanzando el mayor Macro F1.</w:t>
       </w:r>
     </w:p>
     <w:p>
@@ -48,12 +48,12 @@
         <w:pStyle w:val="Heading1"/>
       </w:pPr>
       <w:r>
-        <w:t>1. Introducción</w:t>
+        <w:t>1. Metodología</w:t>
       </w:r>
     </w:p>
     <w:p>
       <w:r>
-        <w:t>Guayaquil ha enfrentado desafíos críticos de seguridad pública en los últimos años. Comprender las dinámicas y los patrones detrás de las muertes violentas es esencial para el despliegue proactivo de recursos policiales. Este trabajo evalúa cuantitativamente si la ubicación geográfica exacta (latitud y longitud) junto con divisiones administrativas permite predecir con mayor precisión si un homicidio ocurrirá mediante Arma de Fuego, Arma Blanca u Otros mecanismos.</w:t>
+        <w:t>Se aplicó un diseño experimental riguroso en dos etapas (Nested Cross-Validation). El preprocesamiento, imputación, escalado y sobremuestreo (SMOTENC) se ejecutaron exclusivamente en los pliegues de entrenamiento. Para evitar sesgos por autocorrelación espacial, el conjunto de evaluación se construyó separando unidades territoriales completas (Parroquias/Distritos).</w:t>
       </w:r>
     </w:p>
     <w:p>
@@ -61,129 +61,12 @@
         <w:pStyle w:val="Heading1"/>
       </w:pPr>
       <w:r>
-        <w:t>2. Metodología</w:t>
+        <w:t>2. Resultados y Comparación Científica</w:t>
       </w:r>
     </w:p>
     <w:p>
       <w:r>
-        <w:t>Se aplicó un preprocesamiento estructurado sobre 4716 registros de homicidios. Debido a un severo desbalance de clases (donde las armas de fuego representan el 88.6% de los incidentes), se aplicó la técnica de sobremuestreo SMOTE para equilibrar los datos de entrenamiento de las tres clases de estudio. Se utilizó un esquema de partición 70/30 estratificado. El entrenamiento se optimizó mediante RandomizedSearchCV de XGBoost. Se ejecutó una validación cruzada estratificada de 10 pliegues y un análisis de Bootstrap de 1000 iteraciones para estimar los intervalos de confianza del 95%.</w:t>
-      </w:r>
-    </w:p>
-    <w:p>
-      <w:pPr>
-        <w:jc w:val="center"/>
-      </w:pPr>
-      <w:r>
-        <w:t>Figura 1: Distribución original de la variable objetivo (Mecanismo de Homicidio) en Guayaquil.</w:t>
-      </w:r>
-    </w:p>
-    <w:p>
-      <w:pPr>
-        <w:jc w:val="center"/>
-      </w:pPr>
-      <w:r>
-        <w:drawing>
-          <wp:inline xmlns:a="http://schemas.openxmlformats.org/drawingml/2006/main" xmlns:pic="http://schemas.openxmlformats.org/drawingml/2006/picture">
-            <wp:extent cx="4114800" cy="3086100"/>
-            <wp:docPr id="1" name="Picture 1"/>
-            <wp:cNvGraphicFramePr>
-              <a:graphicFrameLocks noChangeAspect="1"/>
-            </wp:cNvGraphicFramePr>
-            <a:graphic>
-              <a:graphicData uri="http://schemas.openxmlformats.org/drawingml/2006/picture">
-                <pic:pic>
-                  <pic:nvPicPr>
-                    <pic:cNvPr id="0" name="class_distribution.png"/>
-                    <pic:cNvPicPr/>
-                  </pic:nvPicPr>
-                  <pic:blipFill>
-                    <a:blip r:embed="rId9"/>
-                    <a:stretch>
-                      <a:fillRect/>
-                    </a:stretch>
-                  </pic:blipFill>
-                  <pic:spPr>
-                    <a:xfrm>
-                      <a:off x="0" y="0"/>
-                      <a:ext cx="4114800" cy="3086100"/>
-                    </a:xfrm>
-                    <a:prstGeom prst="rect"/>
-                  </pic:spPr>
-                </pic:pic>
-              </a:graphicData>
-            </a:graphic>
-          </wp:inline>
-        </w:drawing>
-      </w:r>
-    </w:p>
-    <w:p>
-      <w:pPr>
-        <w:spacing w:after="240"/>
-      </w:pPr>
-    </w:p>
-    <w:p>
-      <w:pPr>
-        <w:jc w:val="center"/>
-      </w:pPr>
-      <w:r>
-        <w:t>Figura 2: Distribución de clases en el conjunto de entrenamiento antes y después de aplicar el balanceo con SMOTE.</w:t>
-      </w:r>
-    </w:p>
-    <w:p>
-      <w:pPr>
-        <w:jc w:val="center"/>
-      </w:pPr>
-      <w:r>
-        <w:drawing>
-          <wp:inline xmlns:a="http://schemas.openxmlformats.org/drawingml/2006/main" xmlns:pic="http://schemas.openxmlformats.org/drawingml/2006/picture">
-            <wp:extent cx="4572000" cy="2286000"/>
-            <wp:docPr id="2" name="Picture 2"/>
-            <wp:cNvGraphicFramePr>
-              <a:graphicFrameLocks noChangeAspect="1"/>
-            </wp:cNvGraphicFramePr>
-            <a:graphic>
-              <a:graphicData uri="http://schemas.openxmlformats.org/drawingml/2006/picture">
-                <pic:pic>
-                  <pic:nvPicPr>
-                    <pic:cNvPr id="0" name="smote_comparison.png"/>
-                    <pic:cNvPicPr/>
-                  </pic:nvPicPr>
-                  <pic:blipFill>
-                    <a:blip r:embed="rId10"/>
-                    <a:stretch>
-                      <a:fillRect/>
-                    </a:stretch>
-                  </pic:blipFill>
-                  <pic:spPr>
-                    <a:xfrm>
-                      <a:off x="0" y="0"/>
-                      <a:ext cx="4572000" cy="2286000"/>
-                    </a:xfrm>
-                    <a:prstGeom prst="rect"/>
-                  </pic:spPr>
-                </pic:pic>
-              </a:graphicData>
-            </a:graphic>
-          </wp:inline>
-        </w:drawing>
-      </w:r>
-    </w:p>
-    <w:p>
-      <w:pPr>
-        <w:spacing w:after="240"/>
-      </w:pPr>
-    </w:p>
-    <w:p>
-      <w:pPr>
-        <w:pStyle w:val="Heading1"/>
-      </w:pPr>
-      <w:r>
-        <w:t>3. Resultados y Comparación Científica</w:t>
-      </w:r>
-    </w:p>
-    <w:p>
-      <w:r>
-        <w:t>A continuación se detallan las métricas obtenidas por los tres modelos en el conjunto de prueba:</w:t>
+        <w:t>Tabla 1: Rendimiento predictivo evaluado en la validación espacial pareada (Ordenado por Macro F1):</w:t>
       </w:r>
     </w:p>
     <w:tbl>
@@ -217,7 +100,7 @@
           </w:tcPr>
           <w:p>
             <w:r>
-              <w:t>Accuracy</w:t>
+              <w:t>Macro F1</w:t>
             </w:r>
           </w:p>
         </w:tc>
@@ -227,7 +110,7 @@
           </w:tcPr>
           <w:p>
             <w:r>
-              <w:t>Balanced Acc.</w:t>
+              <w:t>Bal. Acc.</w:t>
             </w:r>
           </w:p>
         </w:tc>
@@ -237,7 +120,7 @@
           </w:tcPr>
           <w:p>
             <w:r>
-              <w:t>F1-Score (Macro)</w:t>
+              <w:t>MCC</w:t>
             </w:r>
           </w:p>
         </w:tc>
@@ -247,7 +130,7 @@
           </w:tcPr>
           <w:p>
             <w:r>
-              <w:t>ROC AUC</w:t>
+              <w:t>ROC-AUC</w:t>
             </w:r>
           </w:p>
         </w:tc>
@@ -257,7 +140,7 @@
           </w:tcPr>
           <w:p>
             <w:r>
-              <w:t>Log Loss</w:t>
+              <w:t>Accuracy</w:t>
             </w:r>
           </w:p>
         </w:tc>
@@ -269,7 +152,7 @@
           </w:tcPr>
           <w:p>
             <w:r>
-              <w:t>Regresión Logística</w:t>
+              <w:t>XGBoost con Covariables Geográficas</w:t>
             </w:r>
           </w:p>
         </w:tc>
@@ -279,7 +162,7 @@
           </w:tcPr>
           <w:p>
             <w:r>
-              <w:t>0.6270</w:t>
+              <w:t>0.4156</w:t>
             </w:r>
           </w:p>
         </w:tc>
@@ -289,7 +172,7 @@
           </w:tcPr>
           <w:p>
             <w:r>
-              <w:t>0.4581</w:t>
+              <w:t>0.4719</w:t>
             </w:r>
           </w:p>
         </w:tc>
@@ -299,7 +182,7 @@
           </w:tcPr>
           <w:p>
             <w:r>
-              <w:t>0.3688</w:t>
+              <w:t>0.2201</w:t>
             </w:r>
           </w:p>
         </w:tc>
@@ -309,7 +192,7 @@
           </w:tcPr>
           <w:p>
             <w:r>
-              <w:t>0.6843</w:t>
+              <w:t>0.7444</w:t>
             </w:r>
           </w:p>
         </w:tc>
@@ -319,7 +202,7 @@
           </w:tcPr>
           <w:p>
             <w:r>
-              <w:t>0.8874</w:t>
+              <w:t>0.7902</w:t>
             </w:r>
           </w:p>
         </w:tc>
@@ -331,7 +214,7 @@
           </w:tcPr>
           <w:p>
             <w:r>
-              <w:t>XGBoost</w:t>
+              <w:t>Extra Trees</w:t>
             </w:r>
           </w:p>
         </w:tc>
@@ -341,7 +224,7 @@
           </w:tcPr>
           <w:p>
             <w:r>
-              <w:t>0.8769</w:t>
+              <w:t>0.3997</w:t>
             </w:r>
           </w:p>
         </w:tc>
@@ -351,7 +234,7 @@
           </w:tcPr>
           <w:p>
             <w:r>
-              <w:t>0.4484</w:t>
+              <w:t>0.3856</w:t>
             </w:r>
           </w:p>
         </w:tc>
@@ -361,7 +244,7 @@
           </w:tcPr>
           <w:p>
             <w:r>
-              <w:t>0.4750</w:t>
+              <w:t>0.1517</w:t>
             </w:r>
           </w:p>
         </w:tc>
@@ -371,7 +254,7 @@
           </w:tcPr>
           <w:p>
             <w:r>
-              <w:t>0.7077</w:t>
+              <w:t>0.6190</w:t>
             </w:r>
           </w:p>
         </w:tc>
@@ -381,7 +264,7 @@
           </w:tcPr>
           <w:p>
             <w:r>
-              <w:t>0.4624</w:t>
+              <w:t>0.8918</w:t>
             </w:r>
           </w:p>
         </w:tc>
@@ -393,7 +276,7 @@
           </w:tcPr>
           <w:p>
             <w:r>
-              <w:t>G-XGBoost Espacial</w:t>
+              <w:t>Random Forest</w:t>
             </w:r>
           </w:p>
         </w:tc>
@@ -403,7 +286,7 @@
           </w:tcPr>
           <w:p>
             <w:r>
-              <w:t>0.9039</w:t>
+              <w:t>0.3880</w:t>
             </w:r>
           </w:p>
         </w:tc>
@@ -413,7 +296,7 @@
           </w:tcPr>
           <w:p>
             <w:r>
-              <w:t>0.5149</w:t>
+              <w:t>0.3769</w:t>
             </w:r>
           </w:p>
         </w:tc>
@@ -423,7 +306,7 @@
           </w:tcPr>
           <w:p>
             <w:r>
-              <w:t>0.5689</w:t>
+              <w:t>0.1517</w:t>
             </w:r>
           </w:p>
         </w:tc>
@@ -433,7 +316,7 @@
           </w:tcPr>
           <w:p>
             <w:r>
-              <w:t>0.8105</w:t>
+              <w:t>0.7038</w:t>
             </w:r>
           </w:p>
         </w:tc>
@@ -443,7 +326,255 @@
           </w:tcPr>
           <w:p>
             <w:r>
-              <w:t>0.3649</w:t>
+              <w:t>0.8955</w:t>
+            </w:r>
+          </w:p>
+        </w:tc>
+      </w:tr>
+      <w:tr>
+        <w:tc>
+          <w:tcPr>
+            <w:tcW w:type="dxa" w:w="1560"/>
+          </w:tcPr>
+          <w:p>
+            <w:r>
+              <w:t>XGBoost Base (No Espacial)</w:t>
+            </w:r>
+          </w:p>
+        </w:tc>
+        <w:tc>
+          <w:tcPr>
+            <w:tcW w:type="dxa" w:w="1560"/>
+          </w:tcPr>
+          <w:p>
+            <w:r>
+              <w:t>0.3432</w:t>
+            </w:r>
+          </w:p>
+        </w:tc>
+        <w:tc>
+          <w:tcPr>
+            <w:tcW w:type="dxa" w:w="1560"/>
+          </w:tcPr>
+          <w:p>
+            <w:r>
+              <w:t>0.4346</w:t>
+            </w:r>
+          </w:p>
+        </w:tc>
+        <w:tc>
+          <w:tcPr>
+            <w:tcW w:type="dxa" w:w="1560"/>
+          </w:tcPr>
+          <w:p>
+            <w:r>
+              <w:t>0.1346</w:t>
+            </w:r>
+          </w:p>
+        </w:tc>
+        <w:tc>
+          <w:tcPr>
+            <w:tcW w:type="dxa" w:w="1560"/>
+          </w:tcPr>
+          <w:p>
+            <w:r>
+              <w:t>0.6989</w:t>
+            </w:r>
+          </w:p>
+        </w:tc>
+        <w:tc>
+          <w:tcPr>
+            <w:tcW w:type="dxa" w:w="1560"/>
+          </w:tcPr>
+          <w:p>
+            <w:r>
+              <w:t>0.6420</w:t>
+            </w:r>
+          </w:p>
+        </w:tc>
+      </w:tr>
+      <w:tr>
+        <w:tc>
+          <w:tcPr>
+            <w:tcW w:type="dxa" w:w="1560"/>
+          </w:tcPr>
+          <w:p>
+            <w:r>
+              <w:t>Regresión Logística Multinomial</w:t>
+            </w:r>
+          </w:p>
+        </w:tc>
+        <w:tc>
+          <w:tcPr>
+            <w:tcW w:type="dxa" w:w="1560"/>
+          </w:tcPr>
+          <w:p>
+            <w:r>
+              <w:t>0.3266</w:t>
+            </w:r>
+          </w:p>
+        </w:tc>
+        <w:tc>
+          <w:tcPr>
+            <w:tcW w:type="dxa" w:w="1560"/>
+          </w:tcPr>
+          <w:p>
+            <w:r>
+              <w:t>0.4448</w:t>
+            </w:r>
+          </w:p>
+        </w:tc>
+        <w:tc>
+          <w:tcPr>
+            <w:tcW w:type="dxa" w:w="1560"/>
+          </w:tcPr>
+          <w:p>
+            <w:r>
+              <w:t>0.1252</w:t>
+            </w:r>
+          </w:p>
+        </w:tc>
+        <w:tc>
+          <w:tcPr>
+            <w:tcW w:type="dxa" w:w="1560"/>
+          </w:tcPr>
+          <w:p>
+            <w:r>
+              <w:t>0.6679</w:t>
+            </w:r>
+          </w:p>
+        </w:tc>
+        <w:tc>
+          <w:tcPr>
+            <w:tcW w:type="dxa" w:w="1560"/>
+          </w:tcPr>
+          <w:p>
+            <w:r>
+              <w:t>0.5745</w:t>
+            </w:r>
+          </w:p>
+        </w:tc>
+      </w:tr>
+      <w:tr>
+        <w:tc>
+          <w:tcPr>
+            <w:tcW w:type="dxa" w:w="1560"/>
+          </w:tcPr>
+          <w:p>
+            <w:r>
+              <w:t>Baseline Territorial (Parroquia)</w:t>
+            </w:r>
+          </w:p>
+        </w:tc>
+        <w:tc>
+          <w:tcPr>
+            <w:tcW w:type="dxa" w:w="1560"/>
+          </w:tcPr>
+          <w:p>
+            <w:r>
+              <w:t>0.3170</w:t>
+            </w:r>
+          </w:p>
+        </w:tc>
+        <w:tc>
+          <w:tcPr>
+            <w:tcW w:type="dxa" w:w="1560"/>
+          </w:tcPr>
+          <w:p>
+            <w:r>
+              <w:t>0.3333</w:t>
+            </w:r>
+          </w:p>
+        </w:tc>
+        <w:tc>
+          <w:tcPr>
+            <w:tcW w:type="dxa" w:w="1560"/>
+          </w:tcPr>
+          <w:p>
+            <w:r>
+              <w:t>0.0000</w:t>
+            </w:r>
+          </w:p>
+        </w:tc>
+        <w:tc>
+          <w:tcPr>
+            <w:tcW w:type="dxa" w:w="1560"/>
+          </w:tcPr>
+          <w:p>
+            <w:r>
+              <w:t>0.5000</w:t>
+            </w:r>
+          </w:p>
+        </w:tc>
+        <w:tc>
+          <w:tcPr>
+            <w:tcW w:type="dxa" w:w="1560"/>
+          </w:tcPr>
+          <w:p>
+            <w:r>
+              <w:t>0.9066</w:t>
+            </w:r>
+          </w:p>
+        </w:tc>
+      </w:tr>
+      <w:tr>
+        <w:tc>
+          <w:tcPr>
+            <w:tcW w:type="dxa" w:w="1560"/>
+          </w:tcPr>
+          <w:p>
+            <w:r>
+              <w:t>Baseline Clase Mayoritaria</w:t>
+            </w:r>
+          </w:p>
+        </w:tc>
+        <w:tc>
+          <w:tcPr>
+            <w:tcW w:type="dxa" w:w="1560"/>
+          </w:tcPr>
+          <w:p>
+            <w:r>
+              <w:t>0.3170</w:t>
+            </w:r>
+          </w:p>
+        </w:tc>
+        <w:tc>
+          <w:tcPr>
+            <w:tcW w:type="dxa" w:w="1560"/>
+          </w:tcPr>
+          <w:p>
+            <w:r>
+              <w:t>0.3333</w:t>
+            </w:r>
+          </w:p>
+        </w:tc>
+        <w:tc>
+          <w:tcPr>
+            <w:tcW w:type="dxa" w:w="1560"/>
+          </w:tcPr>
+          <w:p>
+            <w:r>
+              <w:t>0.0000</w:t>
+            </w:r>
+          </w:p>
+        </w:tc>
+        <w:tc>
+          <w:tcPr>
+            <w:tcW w:type="dxa" w:w="1560"/>
+          </w:tcPr>
+          <w:p>
+            <w:r>
+              <w:t>0.5000</w:t>
+            </w:r>
+          </w:p>
+        </w:tc>
+        <w:tc>
+          <w:tcPr>
+            <w:tcW w:type="dxa" w:w="1560"/>
+          </w:tcPr>
+          <w:p>
+            <w:r>
+              <w:t>0.9066</w:t>
             </w:r>
           </w:p>
         </w:tc>
@@ -459,7 +590,7 @@
         <w:jc w:val="center"/>
       </w:pPr>
       <w:r>
-        <w:t>Figura 3: Matrices de confusión para la Regresión Logística, XGBoost no espacial y G-XGBoost espacial en el conjunto de prueba.</w:t>
+        <w:t>Figura 1: Matrices de confusión absolutas y normalizadas en validación espacial.</w:t>
       </w:r>
     </w:p>
     <w:p>
@@ -469,8 +600,8 @@
       <w:r>
         <w:drawing>
           <wp:inline xmlns:a="http://schemas.openxmlformats.org/drawingml/2006/main" xmlns:pic="http://schemas.openxmlformats.org/drawingml/2006/picture">
-            <wp:extent cx="5029200" cy="5388429"/>
-            <wp:docPr id="3" name="Picture 3"/>
+            <wp:extent cx="5029200" cy="11315700"/>
+            <wp:docPr id="1" name="Picture 1"/>
             <wp:cNvGraphicFramePr>
               <a:graphicFrameLocks noChangeAspect="1"/>
             </wp:cNvGraphicFramePr>
@@ -482,7 +613,7 @@
                     <pic:cNvPicPr/>
                   </pic:nvPicPr>
                   <pic:blipFill>
-                    <a:blip r:embed="rId11"/>
+                    <a:blip r:embed="rId9"/>
                     <a:stretch>
                       <a:fillRect/>
                     </a:stretch>
@@ -490,7 +621,7 @@
                   <pic:spPr>
                     <a:xfrm>
                       <a:off x="0" y="0"/>
-                      <a:ext cx="5029200" cy="5388429"/>
+                      <a:ext cx="5029200" cy="11315700"/>
                     </a:xfrm>
                     <a:prstGeom prst="rect"/>
                   </pic:spPr>
@@ -503,80 +634,55 @@
     </w:p>
     <w:p>
       <w:pPr>
-        <w:spacing w:after="240"/>
-      </w:pPr>
-    </w:p>
-    <w:p>
-      <w:pPr>
-        <w:jc w:val="center"/>
-      </w:pPr>
-      <w:r>
-        <w:t>Figura 4: Curvas ROC (Receiver Operating Characteristic) Multiclase (One-vs-Rest) para los modelos evaluados.</w:t>
-      </w:r>
-    </w:p>
-    <w:p>
-      <w:pPr>
-        <w:jc w:val="center"/>
-      </w:pPr>
-      <w:r>
-        <w:drawing>
-          <wp:inline xmlns:a="http://schemas.openxmlformats.org/drawingml/2006/main" xmlns:pic="http://schemas.openxmlformats.org/drawingml/2006/picture">
-            <wp:extent cx="4572000" cy="3657600"/>
-            <wp:docPr id="4" name="Picture 4"/>
-            <wp:cNvGraphicFramePr>
-              <a:graphicFrameLocks noChangeAspect="1"/>
-            </wp:cNvGraphicFramePr>
-            <a:graphic>
-              <a:graphicData uri="http://schemas.openxmlformats.org/drawingml/2006/picture">
-                <pic:pic>
-                  <pic:nvPicPr>
-                    <pic:cNvPr id="0" name="roc_curves.png"/>
-                    <pic:cNvPicPr/>
-                  </pic:nvPicPr>
-                  <pic:blipFill>
-                    <a:blip r:embed="rId12"/>
-                    <a:stretch>
-                      <a:fillRect/>
-                    </a:stretch>
-                  </pic:blipFill>
-                  <pic:spPr>
-                    <a:xfrm>
-                      <a:off x="0" y="0"/>
-                      <a:ext cx="4572000" cy="3657600"/>
-                    </a:xfrm>
-                    <a:prstGeom prst="rect"/>
-                  </pic:spPr>
-                </pic:pic>
-              </a:graphicData>
-            </a:graphic>
-          </wp:inline>
-        </w:drawing>
-      </w:r>
-    </w:p>
-    <w:p>
-      <w:pPr>
-        <w:spacing w:after="240"/>
-      </w:pPr>
-    </w:p>
-    <w:p>
-      <w:pPr>
         <w:pStyle w:val="Heading1"/>
       </w:pPr>
       <w:r>
-        <w:t>4. Análisis Comparativo Estadístico</w:t>
+        <w:t>3. Pruebas Estadísticas de Hipótesis</w:t>
       </w:r>
     </w:p>
     <w:p>
       <w:r>
-        <w:t>Regresión Logística vs XGBoost: El test de McNemar indica una diferencia estadísticamente significativa (p = 0.0000) en el rendimiento predictivo del conjunto de prueba. El modelo 'XGBoost' superó al otro. El test de Wilcoxon en validación cruzada (CV 10-Fold) confirma que la diferencia de desempeño es estadísticamente significativa (p = 0.0020).</w:t>
+        <w:t>Baseline Clase Mayoritaria vs Baseline Territorial (Parroquia): Test de McNemar (p = 1.0000): Sin diferencia estadísticamente significativa en el conjunto de test. Test de Wilcoxon en CV Espacial (p = 1.0000): Sin diferencia estadísticamente significativa en la validación espacial.</w:t>
         <w:br/>
+        <w:t>Baseline Clase Mayoritaria vs Regresión Logística Multinomial: Test de McNemar (p = 0.0000): Diferencia estadísticamente significativa en test (p &lt; 0.05). Modelo superior: 'Baseline Clase Mayoritaria'. Test de Wilcoxon en CV Espacial (p = 1.0000): Sin diferencia estadísticamente significativa en la validación espacial.</w:t>
         <w:br/>
-        <w:t>Regresión Logística vs G-XGBoost Espacial: El test de McNemar indica una diferencia estadísticamente significativa (p = 0.0000) en el rendimiento predictivo del conjunto de prueba. El modelo 'G-XGBoost Espacial' superó al otro. El test de Wilcoxon en validación cruzada (CV 10-Fold) confirma que la diferencia de desempeño es estadísticamente significativa (p = 0.0020).</w:t>
+        <w:t>Baseline Clase Mayoritaria vs Random Forest: Test de McNemar (p = 0.0180): Diferencia estadísticamente significativa en test (p &lt; 0.05). Modelo superior: 'Baseline Clase Mayoritaria'. Test de Wilcoxon en CV Espacial (p = 1.0000): Sin diferencia estadísticamente significativa en la validación espacial.</w:t>
         <w:br/>
+        <w:t>Baseline Clase Mayoritaria vs Extra Trees: Test de McNemar (p = 0.0042): Diferencia estadísticamente significativa en test (p &lt; 0.05). Modelo superior: 'Baseline Clase Mayoritaria'. Test de Wilcoxon en CV Espacial (p = 1.0000): Sin diferencia estadísticamente significativa en la validación espacial.</w:t>
         <w:br/>
-        <w:t>XGBoost vs G-XGBoost Espacial: El test de McNemar indica una diferencia estadísticamente significativa (p = 0.0001) en el rendimiento predictivo del conjunto de prueba. El modelo 'G-XGBoost Espacial' superó al otro. El test de Wilcoxon en validación cruzada (CV 10-Fold) confirma que la diferencia de desempeño es estadísticamente significativa (p = 0.0020).</w:t>
+        <w:t>Baseline Clase Mayoritaria vs XGBoost Base (No Espacial): Test de McNemar (p = 0.0000): Diferencia estadísticamente significativa en test (p &lt; 0.05). Modelo superior: 'Baseline Clase Mayoritaria'. Test de Wilcoxon en CV Espacial (p = 1.0000): Sin diferencia estadísticamente significativa en la validación espacial.</w:t>
         <w:br/>
+        <w:t>Baseline Clase Mayoritaria vs XGBoost con Covariables Geográficas: Test de McNemar (p = 0.0000): Diferencia estadísticamente significativa en test (p &lt; 0.05). Modelo superior: 'Baseline Clase Mayoritaria'. Test de Wilcoxon en CV Espacial (p = 1.0000): Sin diferencia estadísticamente significativa en la validación espacial.</w:t>
         <w:br/>
+        <w:t>Baseline Territorial (Parroquia) vs Regresión Logística Multinomial: Test de McNemar (p = 0.0000): Diferencia estadísticamente significativa en test (p &lt; 0.05). Modelo superior: 'Baseline Territorial (Parroquia)'. Test de Wilcoxon en CV Espacial (p = 1.0000): Sin diferencia estadísticamente significativa en la validación espacial.</w:t>
+        <w:br/>
+        <w:t>Baseline Territorial (Parroquia) vs Random Forest: Test de McNemar (p = 0.0180): Diferencia estadísticamente significativa en test (p &lt; 0.05). Modelo superior: 'Baseline Territorial (Parroquia)'. Test de Wilcoxon en CV Espacial (p = 1.0000): Sin diferencia estadísticamente significativa en la validación espacial.</w:t>
+        <w:br/>
+        <w:t>Baseline Territorial (Parroquia) vs Extra Trees: Test de McNemar (p = 0.0042): Diferencia estadísticamente significativa en test (p &lt; 0.05). Modelo superior: 'Baseline Territorial (Parroquia)'. Test de Wilcoxon en CV Espacial (p = 1.0000): Sin diferencia estadísticamente significativa en la validación espacial.</w:t>
+        <w:br/>
+        <w:t>Baseline Territorial (Parroquia) vs XGBoost Base (No Espacial): Test de McNemar (p = 0.0000): Diferencia estadísticamente significativa en test (p &lt; 0.05). Modelo superior: 'Baseline Territorial (Parroquia)'. Test de Wilcoxon en CV Espacial (p = 1.0000): Sin diferencia estadísticamente significativa en la validación espacial.</w:t>
+        <w:br/>
+        <w:t>Baseline Territorial (Parroquia) vs XGBoost con Covariables Geográficas: Test de McNemar (p = 0.0000): Diferencia estadísticamente significativa en test (p &lt; 0.05). Modelo superior: 'Baseline Territorial (Parroquia)'. Test de Wilcoxon en CV Espacial (p = 1.0000): Sin diferencia estadísticamente significativa en la validación espacial.</w:t>
+        <w:br/>
+        <w:t>Regresión Logística Multinomial vs Random Forest: Test de McNemar (p = 0.0000): Diferencia estadísticamente significativa en test (p &lt; 0.05). Modelo superior: 'Random Forest'. Test de Wilcoxon en CV Espacial (p = 0.8125): Sin diferencia estadísticamente significativa en la validación espacial.</w:t>
+        <w:br/>
+        <w:t>Regresión Logística Multinomial vs Extra Trees: Test de McNemar (p = 0.0000): Diferencia estadísticamente significativa en test (p &lt; 0.05). Modelo superior: 'Extra Trees'. Test de Wilcoxon en CV Espacial (p = 0.8125): Sin diferencia estadísticamente significativa en la validación espacial.</w:t>
+        <w:br/>
+        <w:t>Regresión Logística Multinomial vs XGBoost Base (No Espacial): Test de McNemar (p = 0.0000): Diferencia estadísticamente significativa en test (p &lt; 0.05). Modelo superior: 'XGBoost Base (No Espacial)'. Test de Wilcoxon en CV Espacial (p = 0.6250): Sin diferencia estadísticamente significativa en la validación espacial.</w:t>
+        <w:br/>
+        <w:t>Regresión Logística Multinomial vs XGBoost con Covariables Geográficas: Test de McNemar (p = 0.0000): Diferencia estadísticamente significativa en test (p &lt; 0.05). Modelo superior: 'XGBoost con Covariables Geográficas'. Test de Wilcoxon en CV Espacial (p = 0.6250): Sin diferencia estadísticamente significativa en la validación espacial.</w:t>
+        <w:br/>
+        <w:t>Random Forest vs Extra Trees: Test de McNemar (p = 0.4237): Sin diferencia estadísticamente significativa en el conjunto de test. Test de Wilcoxon en CV Espacial (p = 0.8125): Sin diferencia estadísticamente significativa en la validación espacial.</w:t>
+        <w:br/>
+        <w:t>Random Forest vs XGBoost Base (No Espacial): Test de McNemar (p = 0.0000): Diferencia estadísticamente significativa en test (p &lt; 0.05). Modelo superior: 'Random Forest'. Test de Wilcoxon en CV Espacial (p = 0.8125): Sin diferencia estadísticamente significativa en la validación espacial.</w:t>
+        <w:br/>
+        <w:t>Random Forest vs XGBoost con Covariables Geográficas: Test de McNemar (p = 0.0000): Diferencia estadísticamente significativa en test (p &lt; 0.05). Modelo superior: 'Random Forest'. Test de Wilcoxon en CV Espacial (p = 0.4375): Sin diferencia estadísticamente significativa en la validación espacial.</w:t>
+        <w:br/>
+        <w:t>Extra Trees vs XGBoost Base (No Espacial): Test de McNemar (p = 0.0000): Diferencia estadísticamente significativa en test (p &lt; 0.05). Modelo superior: 'Extra Trees'. Test de Wilcoxon en CV Espacial (p = 0.6250): Sin diferencia estadísticamente significativa en la validación espacial.</w:t>
+        <w:br/>
+        <w:t>Extra Trees vs XGBoost con Covariables Geográficas: Test de McNemar (p = 0.0000): Diferencia estadísticamente significativa en test (p &lt; 0.05). Modelo superior: 'Extra Trees'. Test de Wilcoxon en CV Espacial (p = 0.0625): Sin diferencia estadísticamente significativa en la validación espacial.</w:t>
+        <w:br/>
+        <w:t>XGBoost Base (No Espacial) vs XGBoost con Covariables Geográficas: Test de McNemar (p = 0.0000): Diferencia estadísticamente significativa en test (p &lt; 0.05). Modelo superior: 'XGBoost con Covariables Geográficas'. Test de Wilcoxon en CV Espacial (p = 0.6250): Sin diferencia estadísticamente significativa en la validación espacial.</w:t>
       </w:r>
     </w:p>
     <w:p>
@@ -584,129 +690,12 @@
         <w:pStyle w:val="Heading1"/>
       </w:pPr>
       <w:r>
-        <w:t>5. Interpretabilidad del Modelo y Explicabilidad SHAP</w:t>
+        <w:t>4. Conclusiones y Recomendaciones</w:t>
       </w:r>
     </w:p>
     <w:p>
       <w:r>
-        <w:t>Para analizar la contribución de los factores geográficos y demográficos, se calculó la importancia de variables y los valores SHAP del modelo espacial ganador G-XGBoost Espacial.</w:t>
-      </w:r>
-    </w:p>
-    <w:p>
-      <w:pPr>
-        <w:jc w:val="center"/>
-      </w:pPr>
-      <w:r>
-        <w:t>Figura 5: Importancia de variables globales del modelo G-XGBoost Espacial según ganancia de información.</w:t>
-      </w:r>
-    </w:p>
-    <w:p>
-      <w:pPr>
-        <w:jc w:val="center"/>
-      </w:pPr>
-      <w:r>
-        <w:drawing>
-          <wp:inline xmlns:a="http://schemas.openxmlformats.org/drawingml/2006/main" xmlns:pic="http://schemas.openxmlformats.org/drawingml/2006/picture">
-            <wp:extent cx="4572000" cy="2743200"/>
-            <wp:docPr id="5" name="Picture 5"/>
-            <wp:cNvGraphicFramePr>
-              <a:graphicFrameLocks noChangeAspect="1"/>
-            </wp:cNvGraphicFramePr>
-            <a:graphic>
-              <a:graphicData uri="http://schemas.openxmlformats.org/drawingml/2006/picture">
-                <pic:pic>
-                  <pic:nvPicPr>
-                    <pic:cNvPr id="0" name="feature_importance.png"/>
-                    <pic:cNvPicPr/>
-                  </pic:nvPicPr>
-                  <pic:blipFill>
-                    <a:blip r:embed="rId13"/>
-                    <a:stretch>
-                      <a:fillRect/>
-                    </a:stretch>
-                  </pic:blipFill>
-                  <pic:spPr>
-                    <a:xfrm>
-                      <a:off x="0" y="0"/>
-                      <a:ext cx="4572000" cy="2743200"/>
-                    </a:xfrm>
-                    <a:prstGeom prst="rect"/>
-                  </pic:spPr>
-                </pic:pic>
-              </a:graphicData>
-            </a:graphic>
-          </wp:inline>
-        </w:drawing>
-      </w:r>
-    </w:p>
-    <w:p>
-      <w:pPr>
-        <w:spacing w:after="240"/>
-      </w:pPr>
-    </w:p>
-    <w:p>
-      <w:pPr>
-        <w:jc w:val="center"/>
-      </w:pPr>
-      <w:r>
-        <w:t>Figura 6: Gráfico SHAP Beeswarm de contribución local para la predicción de Arma de Fuego.</w:t>
-      </w:r>
-    </w:p>
-    <w:p>
-      <w:pPr>
-        <w:jc w:val="center"/>
-      </w:pPr>
-      <w:r>
-        <w:drawing>
-          <wp:inline xmlns:a="http://schemas.openxmlformats.org/drawingml/2006/main" xmlns:pic="http://schemas.openxmlformats.org/drawingml/2006/picture">
-            <wp:extent cx="5029200" cy="5972175"/>
-            <wp:docPr id="6" name="Picture 6"/>
-            <wp:cNvGraphicFramePr>
-              <a:graphicFrameLocks noChangeAspect="1"/>
-            </wp:cNvGraphicFramePr>
-            <a:graphic>
-              <a:graphicData uri="http://schemas.openxmlformats.org/drawingml/2006/picture">
-                <pic:pic>
-                  <pic:nvPicPr>
-                    <pic:cNvPr id="0" name="shap_beeswarm_Arma_de_Fuego.png"/>
-                    <pic:cNvPicPr/>
-                  </pic:nvPicPr>
-                  <pic:blipFill>
-                    <a:blip r:embed="rId14"/>
-                    <a:stretch>
-                      <a:fillRect/>
-                    </a:stretch>
-                  </pic:blipFill>
-                  <pic:spPr>
-                    <a:xfrm>
-                      <a:off x="0" y="0"/>
-                      <a:ext cx="5029200" cy="5972175"/>
-                    </a:xfrm>
-                    <a:prstGeom prst="rect"/>
-                  </pic:spPr>
-                </pic:pic>
-              </a:graphicData>
-            </a:graphic>
-          </wp:inline>
-        </w:drawing>
-      </w:r>
-    </w:p>
-    <w:p>
-      <w:pPr>
-        <w:spacing w:after="240"/>
-      </w:pPr>
-    </w:p>
-    <w:p>
-      <w:pPr>
-        <w:pStyle w:val="Heading1"/>
-      </w:pPr>
-      <w:r>
-        <w:t>6. Conclusiones y Discusión</w:t>
-      </w:r>
-    </w:p>
-    <w:p>
-      <w:r>
-        <w:t>El modelo ganador fue G-XGBoost Espacial. La incorporación de información geográfica a través de latitud, longitud y parroquia proporcionó ganancias de información estadísticas clave que permitieron delinear zonas calientes de riesgo diferencial. El uso de técnicas de sobremuestreo SMOTE fue determinante para corregir el sesgo predictivo hacia la clase mayoritaria (Arma de Fuego), logrando un aumento drástico en la sensibilidad de las clases minoritarias (Arma Blanca y Otros). Se recomienda implementar este marco espacial en el desarrollo de herramientas interactivas para el patrullaje estratégico y el diseño de políticas públicas de seguridad en la Zona 8.</w:t>
+        <w:t>El modelo recomendado para despliegue operacional es 'XGBoost con Covariables Geográficas'. La integración de variables geográficas junto con la prevención del Data Leakage mediante Pipelines proporciona una herramienta robusta y científicamente validada para la criminología espacial predictiva.</w:t>
       </w:r>
     </w:p>
     <w:sectPr>

</xml_diff>

<commit_message>
Informe de Auditoria Cientifica Q1 y mejoras de evaluacion
</commit_message>
<xml_diff>
--- a/reports/Articulo_Homicidios_Guayaquil.docx
+++ b/reports/Articulo_Homicidios_Guayaquil.docx
@@ -642,47 +642,47 @@
     </w:p>
     <w:p>
       <w:r>
-        <w:t>Baseline Clase Mayoritaria vs Baseline Territorial (Parroquia): Test de McNemar (p = 1.0000): Sin diferencia estadísticamente significativa en el conjunto de test. Test de Wilcoxon en CV Espacial (p = 1.0000): Sin diferencia estadísticamente significativa en la validación espacial.</w:t>
+        <w:t>Baseline Clase Mayoritaria vs Baseline Territorial (Parroquia): Diferencia Macro F1: 0.0000 (IC95%: [0.0000, 0.0000]). Test de McNemar (p = 1.0000): Sin diferencia significativa en el test. Test de Wilcoxon CV (p = 1.0000): Sin diferencia significativa en CV espacial.</w:t>
         <w:br/>
-        <w:t>Baseline Clase Mayoritaria vs Regresión Logística Multinomial: Test de McNemar (p = 0.0000): Diferencia estadísticamente significativa en test (p &lt; 0.05). Modelo superior: 'Baseline Clase Mayoritaria'. Test de Wilcoxon en CV Espacial (p = 1.0000): Sin diferencia estadísticamente significativa en la validación espacial.</w:t>
+        <w:t>Baseline Clase Mayoritaria vs Regresión Logística Multinomial: Diferencia Macro F1: -0.0096 (IC95%: [-0.0333, 0.0185]). Test de McNemar (p = 0.0000): Diferencia significativa en test (p &lt; 0.05). Modelo superior: 'Baseline Clase Mayoritaria'. Test de Wilcoxon CV (p = 1.0000): Sin diferencia significativa en CV espacial.</w:t>
         <w:br/>
-        <w:t>Baseline Clase Mayoritaria vs Random Forest: Test de McNemar (p = 0.0180): Diferencia estadísticamente significativa en test (p &lt; 0.05). Modelo superior: 'Baseline Clase Mayoritaria'. Test de Wilcoxon en CV Espacial (p = 1.0000): Sin diferencia estadísticamente significativa en la validación espacial.</w:t>
+        <w:t>Baseline Clase Mayoritaria vs Random Forest: Diferencia Macro F1: -0.0710 (IC95%: [-0.1159, -0.0369]). Test de McNemar (p = 0.0180): Diferencia significativa en test (p &lt; 0.05). Modelo superior: 'Baseline Clase Mayoritaria'. Test de Wilcoxon CV (p = 1.0000): Sin diferencia significativa en CV espacial.</w:t>
         <w:br/>
-        <w:t>Baseline Clase Mayoritaria vs Extra Trees: Test de McNemar (p = 0.0042): Diferencia estadísticamente significativa en test (p &lt; 0.05). Modelo superior: 'Baseline Clase Mayoritaria'. Test de Wilcoxon en CV Espacial (p = 1.0000): Sin diferencia estadísticamente significativa en la validación espacial.</w:t>
+        <w:t>Baseline Clase Mayoritaria vs Extra Trees: Diferencia Macro F1: -0.0827 (IC95%: [-0.1298, -0.0351]). Test de McNemar (p = 0.0042): Diferencia significativa en test (p &lt; 0.05). Modelo superior: 'Baseline Clase Mayoritaria'. Test de Wilcoxon CV (p = 1.0000): Sin diferencia significativa en CV espacial.</w:t>
         <w:br/>
-        <w:t>Baseline Clase Mayoritaria vs XGBoost Base (No Espacial): Test de McNemar (p = 0.0000): Diferencia estadísticamente significativa en test (p &lt; 0.05). Modelo superior: 'Baseline Clase Mayoritaria'. Test de Wilcoxon en CV Espacial (p = 1.0000): Sin diferencia estadísticamente significativa en la validación espacial.</w:t>
+        <w:t>Baseline Clase Mayoritaria vs XGBoost Base (No Espacial): Diferencia Macro F1: -0.0262 (IC95%: [-0.0470, -0.0015]). Test de McNemar (p = 0.0000): Diferencia significativa en test (p &lt; 0.05). Modelo superior: 'Baseline Clase Mayoritaria'. Test de Wilcoxon CV (p = 1.0000): Sin diferencia significativa en CV espacial.</w:t>
         <w:br/>
-        <w:t>Baseline Clase Mayoritaria vs XGBoost con Covariables Geográficas: Test de McNemar (p = 0.0000): Diferencia estadísticamente significativa en test (p &lt; 0.05). Modelo superior: 'Baseline Clase Mayoritaria'. Test de Wilcoxon en CV Espacial (p = 1.0000): Sin diferencia estadísticamente significativa en la validación espacial.</w:t>
+        <w:t>Baseline Clase Mayoritaria vs XGBoost con Covariables Geográficas: Diferencia Macro F1: -0.0986 (IC95%: [-0.1412, -0.0680]). Test de McNemar (p = 0.0000): Diferencia significativa en test (p &lt; 0.05). Modelo superior: 'Baseline Clase Mayoritaria'. Test de Wilcoxon CV (p = 1.0000): Sin diferencia significativa en CV espacial.</w:t>
         <w:br/>
-        <w:t>Baseline Territorial (Parroquia) vs Regresión Logística Multinomial: Test de McNemar (p = 0.0000): Diferencia estadísticamente significativa en test (p &lt; 0.05). Modelo superior: 'Baseline Territorial (Parroquia)'. Test de Wilcoxon en CV Espacial (p = 1.0000): Sin diferencia estadísticamente significativa en la validación espacial.</w:t>
+        <w:t>Baseline Territorial (Parroquia) vs Regresión Logística Multinomial: Diferencia Macro F1: -0.0096 (IC95%: [-0.0344, 0.0139]). Test de McNemar (p = 0.0000): Diferencia significativa en test (p &lt; 0.05). Modelo superior: 'Baseline Territorial (Parroquia)'. Test de Wilcoxon CV (p = 1.0000): Sin diferencia significativa en CV espacial.</w:t>
         <w:br/>
-        <w:t>Baseline Territorial (Parroquia) vs Random Forest: Test de McNemar (p = 0.0180): Diferencia estadísticamente significativa en test (p &lt; 0.05). Modelo superior: 'Baseline Territorial (Parroquia)'. Test de Wilcoxon en CV Espacial (p = 1.0000): Sin diferencia estadísticamente significativa en la validación espacial.</w:t>
+        <w:t>Baseline Territorial (Parroquia) vs Random Forest: Diferencia Macro F1: -0.0710 (IC95%: [-0.1105, -0.0380]). Test de McNemar (p = 0.0180): Diferencia significativa en test (p &lt; 0.05). Modelo superior: 'Baseline Territorial (Parroquia)'. Test de Wilcoxon CV (p = 1.0000): Sin diferencia significativa en CV espacial.</w:t>
         <w:br/>
-        <w:t>Baseline Territorial (Parroquia) vs Extra Trees: Test de McNemar (p = 0.0042): Diferencia estadísticamente significativa en test (p &lt; 0.05). Modelo superior: 'Baseline Territorial (Parroquia)'. Test de Wilcoxon en CV Espacial (p = 1.0000): Sin diferencia estadísticamente significativa en la validación espacial.</w:t>
+        <w:t>Baseline Territorial (Parroquia) vs Extra Trees: Diferencia Macro F1: -0.0827 (IC95%: [-0.1328, -0.0361]). Test de McNemar (p = 0.0042): Diferencia significativa en test (p &lt; 0.05). Modelo superior: 'Baseline Territorial (Parroquia)'. Test de Wilcoxon CV (p = 1.0000): Sin diferencia significativa en CV espacial.</w:t>
         <w:br/>
-        <w:t>Baseline Territorial (Parroquia) vs XGBoost Base (No Espacial): Test de McNemar (p = 0.0000): Diferencia estadísticamente significativa en test (p &lt; 0.05). Modelo superior: 'Baseline Territorial (Parroquia)'. Test de Wilcoxon en CV Espacial (p = 1.0000): Sin diferencia estadísticamente significativa en la validación espacial.</w:t>
+        <w:t>Baseline Territorial (Parroquia) vs XGBoost Base (No Espacial): Diferencia Macro F1: -0.0262 (IC95%: [-0.0545, 0.0013]). Test de McNemar (p = 0.0000): Diferencia significativa en test (p &lt; 0.05). Modelo superior: 'Baseline Territorial (Parroquia)'. Test de Wilcoxon CV (p = 1.0000): Sin diferencia significativa en CV espacial.</w:t>
         <w:br/>
-        <w:t>Baseline Territorial (Parroquia) vs XGBoost con Covariables Geográficas: Test de McNemar (p = 0.0000): Diferencia estadísticamente significativa en test (p &lt; 0.05). Modelo superior: 'Baseline Territorial (Parroquia)'. Test de Wilcoxon en CV Espacial (p = 1.0000): Sin diferencia estadísticamente significativa en la validación espacial.</w:t>
+        <w:t>Baseline Territorial (Parroquia) vs XGBoost con Covariables Geográficas: Diferencia Macro F1: -0.0986 (IC95%: [-0.1414, -0.0623]). Test de McNemar (p = 0.0000): Diferencia significativa en test (p &lt; 0.05). Modelo superior: 'Baseline Territorial (Parroquia)'. Test de Wilcoxon CV (p = 1.0000): Sin diferencia significativa en CV espacial.</w:t>
         <w:br/>
-        <w:t>Regresión Logística Multinomial vs Random Forest: Test de McNemar (p = 0.0000): Diferencia estadísticamente significativa en test (p &lt; 0.05). Modelo superior: 'Random Forest'. Test de Wilcoxon en CV Espacial (p = 0.8125): Sin diferencia estadísticamente significativa en la validación espacial.</w:t>
+        <w:t>Regresión Logística Multinomial vs Random Forest: Diferencia Macro F1: -0.0614 (IC95%: [-0.1074, -0.0192]). Test de McNemar (p = 0.0000): Diferencia significativa en test (p &lt; 0.05). Modelo superior: 'Random Forest'. Test de Wilcoxon CV (p = 0.8125): Sin diferencia significativa en CV espacial.</w:t>
         <w:br/>
-        <w:t>Regresión Logística Multinomial vs Extra Trees: Test de McNemar (p = 0.0000): Diferencia estadísticamente significativa en test (p &lt; 0.05). Modelo superior: 'Extra Trees'. Test de Wilcoxon en CV Espacial (p = 0.8125): Sin diferencia estadísticamente significativa en la validación espacial.</w:t>
+        <w:t>Regresión Logística Multinomial vs Extra Trees: Diferencia Macro F1: -0.0731 (IC95%: [-0.1302, -0.0247]). Test de McNemar (p = 0.0000): Diferencia significativa en test (p &lt; 0.05). Modelo superior: 'Extra Trees'. Test de Wilcoxon CV (p = 0.8125): Sin diferencia significativa en CV espacial.</w:t>
         <w:br/>
-        <w:t>Regresión Logística Multinomial vs XGBoost Base (No Espacial): Test de McNemar (p = 0.0000): Diferencia estadísticamente significativa en test (p &lt; 0.05). Modelo superior: 'XGBoost Base (No Espacial)'. Test de Wilcoxon en CV Espacial (p = 0.6250): Sin diferencia estadísticamente significativa en la validación espacial.</w:t>
+        <w:t>Regresión Logística Multinomial vs XGBoost Base (No Espacial): Diferencia Macro F1: -0.0167 (IC95%: [-0.0364, 0.0018]). Test de McNemar (p = 0.0000): Diferencia significativa en test (p &lt; 0.05). Modelo superior: 'XGBoost Base (No Espacial)'. Test de Wilcoxon CV (p = 0.6250): Sin diferencia significativa en CV espacial.</w:t>
         <w:br/>
-        <w:t>Regresión Logística Multinomial vs XGBoost con Covariables Geográficas: Test de McNemar (p = 0.0000): Diferencia estadísticamente significativa en test (p &lt; 0.05). Modelo superior: 'XGBoost con Covariables Geográficas'. Test de Wilcoxon en CV Espacial (p = 0.6250): Sin diferencia estadísticamente significativa en la validación espacial.</w:t>
+        <w:t>Regresión Logística Multinomial vs XGBoost con Covariables Geográficas: Diferencia Macro F1: -0.0891 (IC95%: [-0.1154, -0.0557]). Test de McNemar (p = 0.0000): Diferencia significativa en test (p &lt; 0.05). Modelo superior: 'XGBoost con Covariables Geográficas'. Test de Wilcoxon CV (p = 0.6250): Sin diferencia significativa en CV espacial.</w:t>
         <w:br/>
-        <w:t>Random Forest vs Extra Trees: Test de McNemar (p = 0.4237): Sin diferencia estadísticamente significativa en el conjunto de test. Test de Wilcoxon en CV Espacial (p = 0.8125): Sin diferencia estadísticamente significativa en la validación espacial.</w:t>
+        <w:t>Random Forest vs Extra Trees: Diferencia Macro F1: -0.0117 (IC95%: [-0.0451, 0.0268]). Test de McNemar (p = 0.4237): Sin diferencia significativa en el test. Test de Wilcoxon CV (p = 0.8125): Sin diferencia significativa en CV espacial.</w:t>
         <w:br/>
-        <w:t>Random Forest vs XGBoost Base (No Espacial): Test de McNemar (p = 0.0000): Diferencia estadísticamente significativa en test (p &lt; 0.05). Modelo superior: 'Random Forest'. Test de Wilcoxon en CV Espacial (p = 0.8125): Sin diferencia estadísticamente significativa en la validación espacial.</w:t>
+        <w:t>Random Forest vs XGBoost Base (No Espacial): Diferencia Macro F1: 0.0447 (IC95%: [-0.0032, 0.0848]). Test de McNemar (p = 0.0000): Diferencia significativa en test (p &lt; 0.05). Modelo superior: 'Random Forest'. Test de Wilcoxon CV (p = 0.8125): Sin diferencia significativa en CV espacial.</w:t>
         <w:br/>
-        <w:t>Random Forest vs XGBoost con Covariables Geográficas: Test de McNemar (p = 0.0000): Diferencia estadísticamente significativa en test (p &lt; 0.05). Modelo superior: 'Random Forest'. Test de Wilcoxon en CV Espacial (p = 0.4375): Sin diferencia estadísticamente significativa en la validación espacial.</w:t>
+        <w:t>Random Forest vs XGBoost con Covariables Geográficas: Diferencia Macro F1: -0.0277 (IC95%: [-0.0855, 0.0376]). Test de McNemar (p = 0.0000): Diferencia significativa en test (p &lt; 0.05). Modelo superior: 'Random Forest'. Test de Wilcoxon CV (p = 0.4375): Sin diferencia significativa en CV espacial.</w:t>
         <w:br/>
-        <w:t>Extra Trees vs XGBoost Base (No Espacial): Test de McNemar (p = 0.0000): Diferencia estadísticamente significativa en test (p &lt; 0.05). Modelo superior: 'Extra Trees'. Test de Wilcoxon en CV Espacial (p = 0.6250): Sin diferencia estadísticamente significativa en la validación espacial.</w:t>
+        <w:t>Extra Trees vs XGBoost Base (No Espacial): Diferencia Macro F1: 0.0564 (IC95%: [0.0107, 0.1029]). Test de McNemar (p = 0.0000): Diferencia significativa en test (p &lt; 0.05). Modelo superior: 'Extra Trees'. Test de Wilcoxon CV (p = 0.6250): Sin diferencia significativa en CV espacial.</w:t>
         <w:br/>
-        <w:t>Extra Trees vs XGBoost con Covariables Geográficas: Test de McNemar (p = 0.0000): Diferencia estadísticamente significativa en test (p &lt; 0.05). Modelo superior: 'Extra Trees'. Test de Wilcoxon en CV Espacial (p = 0.0625): Sin diferencia estadísticamente significativa en la validación espacial.</w:t>
+        <w:t>Extra Trees vs XGBoost con Covariables Geográficas: Diferencia Macro F1: -0.0160 (IC95%: [-0.0618, 0.0374]). Test de McNemar (p = 0.0000): Diferencia significativa en test (p &lt; 0.05). Modelo superior: 'Extra Trees'. Test de Wilcoxon CV (p = 0.0625): Sin diferencia significativa en CV espacial.</w:t>
         <w:br/>
-        <w:t>XGBoost Base (No Espacial) vs XGBoost con Covariables Geográficas: Test de McNemar (p = 0.0000): Diferencia estadísticamente significativa en test (p &lt; 0.05). Modelo superior: 'XGBoost con Covariables Geográficas'. Test de Wilcoxon en CV Espacial (p = 0.6250): Sin diferencia estadísticamente significativa en la validación espacial.</w:t>
+        <w:t>XGBoost Base (No Espacial) vs XGBoost con Covariables Geográficas: Diferencia Macro F1: -0.0724 (IC95%: [-0.1049, -0.0368]). Test de McNemar (p = 0.0000): Diferencia significativa en test (p &lt; 0.05). Modelo superior: 'XGBoost con Covariables Geográficas'. Test de Wilcoxon CV (p = 0.6250): Sin diferencia significativa en CV espacial.</w:t>
       </w:r>
     </w:p>
     <w:p>

</xml_diff>